<commit_message>
Subida de docs sprint 3
</commit_message>
<xml_diff>
--- a/Fase 2/Evidencias Proyecto/Evidencias de documentación/(Sprint 3) 08 Documento validando Sprint Review.docx
+++ b/Fase 2/Evidencias Proyecto/Evidencias de documentación/(Sprint 3) 08 Documento validando Sprint Review.docx
@@ -1,6 +1,6 @@
 
 <file path=word/document.xml><?xml version="1.0" encoding="utf-8"?>
-<w:document xmlns:wpc="http://schemas.microsoft.com/office/word/2010/wordprocessingCanvas" xmlns:cx="http://schemas.microsoft.com/office/drawing/2014/chartex" xmlns:mc="http://schemas.openxmlformats.org/markup-compatibility/2006" xmlns:o="urn:schemas-microsoft-com:office:office" xmlns:r="http://schemas.openxmlformats.org/officeDocument/2006/relationships" xmlns:m="http://schemas.openxmlformats.org/officeDocument/2006/math" xmlns:v="urn:schemas-microsoft-com:vml" xmlns:wp14="http://schemas.microsoft.com/office/word/2010/wordprocessingDrawing" xmlns:wp="http://schemas.openxmlformats.org/drawingml/2006/wordprocessingDrawing" xmlns:w10="urn:schemas-microsoft-com:office:word" xmlns:w="http://schemas.openxmlformats.org/wordprocessingml/2006/main" xmlns:w14="http://schemas.microsoft.com/office/word/2010/wordml" xmlns:w15="http://schemas.microsoft.com/office/word/2012/wordml" xmlns:w16se="http://schemas.microsoft.com/office/word/2015/wordml/symex" xmlns:wpg="http://schemas.microsoft.com/office/word/2010/wordprocessingGroup" xmlns:wpi="http://schemas.microsoft.com/office/word/2010/wordprocessingInk" xmlns:wne="http://schemas.microsoft.com/office/word/2006/wordml" xmlns:wps="http://schemas.microsoft.com/office/word/2010/wordprocessingShape" mc:Ignorable="w14 w15 w16se wp14">
+<w:document xmlns:wpc="http://schemas.microsoft.com/office/word/2010/wordprocessingCanvas" xmlns:cx="http://schemas.microsoft.com/office/drawing/2014/chartex" xmlns:cx1="http://schemas.microsoft.com/office/drawing/2015/9/8/chartex" xmlns:cx2="http://schemas.microsoft.com/office/drawing/2015/10/21/chartex" xmlns:cx3="http://schemas.microsoft.com/office/drawing/2016/5/9/chartex" xmlns:cx4="http://schemas.microsoft.com/office/drawing/2016/5/10/chartex" xmlns:cx5="http://schemas.microsoft.com/office/drawing/2016/5/11/chartex" xmlns:cx6="http://schemas.microsoft.com/office/drawing/2016/5/12/chartex" xmlns:cx7="http://schemas.microsoft.com/office/drawing/2016/5/13/chartex" xmlns:cx8="http://schemas.microsoft.com/office/drawing/2016/5/14/chartex" xmlns:mc="http://schemas.openxmlformats.org/markup-compatibility/2006" xmlns:aink="http://schemas.microsoft.com/office/drawing/2016/ink" xmlns:am3d="http://schemas.microsoft.com/office/drawing/2017/model3d" xmlns:o="urn:schemas-microsoft-com:office:office" xmlns:oel="http://schemas.microsoft.com/office/2019/extlst" xmlns:r="http://schemas.openxmlformats.org/officeDocument/2006/relationships" xmlns:m="http://schemas.openxmlformats.org/officeDocument/2006/math" xmlns:v="urn:schemas-microsoft-com:vml" xmlns:wp14="http://schemas.microsoft.com/office/word/2010/wordprocessingDrawing" xmlns:wp="http://schemas.openxmlformats.org/drawingml/2006/wordprocessingDrawing" xmlns:w10="urn:schemas-microsoft-com:office:word" xmlns:w="http://schemas.openxmlformats.org/wordprocessingml/2006/main" xmlns:w14="http://schemas.microsoft.com/office/word/2010/wordml" xmlns:w15="http://schemas.microsoft.com/office/word/2012/wordml" xmlns:w16cex="http://schemas.microsoft.com/office/word/2018/wordml/cex" xmlns:w16cid="http://schemas.microsoft.com/office/word/2016/wordml/cid" xmlns:w16="http://schemas.microsoft.com/office/word/2018/wordml" xmlns:w16du="http://schemas.microsoft.com/office/word/2023/wordml/word16du" xmlns:w16sdtdh="http://schemas.microsoft.com/office/word/2020/wordml/sdtdatahash" xmlns:w16sdtfl="http://schemas.microsoft.com/office/word/2024/wordml/sdtformatlock" xmlns:w16se="http://schemas.microsoft.com/office/word/2015/wordml/symex" xmlns:wpg="http://schemas.microsoft.com/office/word/2010/wordprocessingGroup" xmlns:wpi="http://schemas.microsoft.com/office/word/2010/wordprocessingInk" xmlns:wne="http://schemas.microsoft.com/office/word/2006/wordml" xmlns:wps="http://schemas.microsoft.com/office/word/2010/wordprocessingShape" mc:Ignorable="w14 w15 w16se w16cid w16 w16cex w16sdtdh w16sdtfl w16du wp14">
   <w:body>
     <w:p>
       <w:pPr>
@@ -179,7 +179,6 @@
         </w:rPr>
         <w:t xml:space="preserve"> “</w:t>
       </w:r>
-      <w:proofErr w:type="spellStart"/>
       <w:r>
         <w:rPr>
           <w:b/>
@@ -189,7 +188,6 @@
         </w:rPr>
         <w:t>RehabControl</w:t>
       </w:r>
-      <w:proofErr w:type="spellEnd"/>
       <w:r>
         <w:rPr>
           <w:b/>
@@ -263,7 +261,43 @@
           <w:sz w:val="36"/>
           <w:szCs w:val="36"/>
         </w:rPr>
-        <w:t xml:space="preserve"> [05/06</w:t>
+        <w:t xml:space="preserve"> [</w:t>
+      </w:r>
+      <w:r>
+        <w:rPr>
+          <w:b/>
+          <w:bCs/>
+          <w:i/>
+          <w:iCs/>
+          <w:color w:val="00B050"/>
+          <w:sz w:val="36"/>
+          <w:szCs w:val="36"/>
+        </w:rPr>
+        <w:t>20</w:t>
+      </w:r>
+      <w:r>
+        <w:rPr>
+          <w:b/>
+          <w:bCs/>
+          <w:i/>
+          <w:iCs/>
+          <w:color w:val="00B050"/>
+          <w:sz w:val="36"/>
+          <w:szCs w:val="36"/>
+        </w:rPr>
+        <w:t>/0</w:t>
+      </w:r>
+      <w:r>
+        <w:rPr>
+          <w:b/>
+          <w:bCs/>
+          <w:i/>
+          <w:iCs/>
+          <w:color w:val="00B050"/>
+          <w:sz w:val="36"/>
+          <w:szCs w:val="36"/>
+        </w:rPr>
+        <w:t>5</w:t>
       </w:r>
       <w:r>
         <w:rPr>
@@ -582,7 +616,6 @@
           <w:docPartUnique/>
         </w:docPartObj>
       </w:sdtPr>
-      <w:sdtEndPr/>
       <w:sdtContent>
         <w:p>
           <w:pPr>
@@ -1006,17 +1039,8 @@
                 <w:sz w:val="24"/>
                 <w:szCs w:val="24"/>
               </w:rPr>
-              <w:t xml:space="preserve">Inicio sprint </w:t>
-            </w:r>
-            <w:proofErr w:type="spellStart"/>
-            <w:r>
-              <w:rPr>
-                <w:sz w:val="24"/>
-                <w:szCs w:val="24"/>
-              </w:rPr>
-              <w:t>review</w:t>
-            </w:r>
-            <w:proofErr w:type="spellEnd"/>
+              <w:t>Inicio sprint review</w:t>
+            </w:r>
           </w:p>
         </w:tc>
         <w:tc>
@@ -1039,17 +1063,8 @@
                 <w:sz w:val="24"/>
                 <w:szCs w:val="24"/>
               </w:rPr>
-              <w:t xml:space="preserve">Diego </w:t>
-            </w:r>
-            <w:proofErr w:type="spellStart"/>
-            <w:r>
-              <w:rPr>
-                <w:sz w:val="24"/>
-                <w:szCs w:val="24"/>
-              </w:rPr>
-              <w:t>Mattas</w:t>
-            </w:r>
-            <w:proofErr w:type="spellEnd"/>
+              <w:t>Diego Mattas</w:t>
+            </w:r>
           </w:p>
         </w:tc>
       </w:tr>
@@ -1206,8 +1221,6 @@
           <w:u w:val="single"/>
         </w:rPr>
       </w:pPr>
-      <w:bookmarkStart w:id="3" w:name="_GoBack"/>
-      <w:bookmarkEnd w:id="3"/>
     </w:p>
     <w:p>
       <w:pPr>
@@ -1218,8 +1231,8 @@
           <w:szCs w:val="24"/>
         </w:rPr>
       </w:pPr>
-      <w:bookmarkStart w:id="4" w:name="_heading=h.rq7jb2dbis75" w:colFirst="0" w:colLast="0"/>
-      <w:bookmarkEnd w:id="4"/>
+      <w:bookmarkStart w:id="3" w:name="_heading=h.rq7jb2dbis75" w:colFirst="0" w:colLast="0"/>
+      <w:bookmarkEnd w:id="3"/>
       <w:r>
         <w:rPr>
           <w:color w:val="000000"/>
@@ -1253,7 +1266,6 @@
         <w:tc>
           <w:tcPr>
             <w:tcW w:w="3071" w:type="dxa"/>
-            <w:shd w:val="clear" w:color="auto" w:fill="auto"/>
           </w:tcPr>
           <w:p>
             <w:pPr>
@@ -1267,19 +1279,13 @@
         <w:tc>
           <w:tcPr>
             <w:tcW w:w="5649" w:type="dxa"/>
-            <w:shd w:val="clear" w:color="auto" w:fill="auto"/>
           </w:tcPr>
           <w:p>
             <w:pPr>
               <w:spacing w:after="0" w:line="240" w:lineRule="auto"/>
             </w:pPr>
-            <w:proofErr w:type="spellStart"/>
-            <w:r>
-              <w:t>Duoc</w:t>
-            </w:r>
-            <w:proofErr w:type="spellEnd"/>
-            <w:r>
-              <w:t xml:space="preserve"> UC. Escuela de Informática y Telecomunicaciones</w:t>
+            <w:r>
+              <w:t>Duoc UC. Escuela de Informática y Telecomunicaciones</w:t>
             </w:r>
           </w:p>
         </w:tc>
@@ -1288,7 +1294,6 @@
         <w:tc>
           <w:tcPr>
             <w:tcW w:w="3071" w:type="dxa"/>
-            <w:shd w:val="clear" w:color="auto" w:fill="auto"/>
           </w:tcPr>
           <w:p>
             <w:pPr>
@@ -1302,7 +1307,6 @@
         <w:tc>
           <w:tcPr>
             <w:tcW w:w="5649" w:type="dxa"/>
-            <w:shd w:val="clear" w:color="auto" w:fill="auto"/>
           </w:tcPr>
           <w:p>
             <w:pPr>
@@ -1318,7 +1322,6 @@
         <w:tc>
           <w:tcPr>
             <w:tcW w:w="3071" w:type="dxa"/>
-            <w:shd w:val="clear" w:color="auto" w:fill="auto"/>
           </w:tcPr>
           <w:p>
             <w:pPr>
@@ -1332,17 +1335,14 @@
         <w:tc>
           <w:tcPr>
             <w:tcW w:w="5649" w:type="dxa"/>
-            <w:shd w:val="clear" w:color="auto" w:fill="auto"/>
           </w:tcPr>
           <w:p>
             <w:pPr>
               <w:spacing w:after="0" w:line="240" w:lineRule="auto"/>
             </w:pPr>
-            <w:proofErr w:type="spellStart"/>
             <w:r>
               <w:t>RehabControl</w:t>
             </w:r>
-            <w:proofErr w:type="spellEnd"/>
           </w:p>
         </w:tc>
       </w:tr>
@@ -1350,7 +1350,6 @@
         <w:tc>
           <w:tcPr>
             <w:tcW w:w="3071" w:type="dxa"/>
-            <w:shd w:val="clear" w:color="auto" w:fill="auto"/>
           </w:tcPr>
           <w:p>
             <w:pPr>
@@ -1364,7 +1363,6 @@
         <w:tc>
           <w:tcPr>
             <w:tcW w:w="5649" w:type="dxa"/>
-            <w:shd w:val="clear" w:color="auto" w:fill="auto"/>
           </w:tcPr>
           <w:p>
             <w:pPr>
@@ -1387,7 +1385,6 @@
         <w:tc>
           <w:tcPr>
             <w:tcW w:w="3071" w:type="dxa"/>
-            <w:shd w:val="clear" w:color="auto" w:fill="auto"/>
           </w:tcPr>
           <w:p>
             <w:pPr>
@@ -1401,7 +1398,6 @@
         <w:tc>
           <w:tcPr>
             <w:tcW w:w="5649" w:type="dxa"/>
-            <w:shd w:val="clear" w:color="auto" w:fill="auto"/>
           </w:tcPr>
           <w:p>
             <w:pPr>
@@ -1417,7 +1413,6 @@
         <w:tc>
           <w:tcPr>
             <w:tcW w:w="3071" w:type="dxa"/>
-            <w:shd w:val="clear" w:color="auto" w:fill="auto"/>
           </w:tcPr>
           <w:p>
             <w:pPr>
@@ -1431,7 +1426,6 @@
         <w:tc>
           <w:tcPr>
             <w:tcW w:w="5649" w:type="dxa"/>
-            <w:shd w:val="clear" w:color="auto" w:fill="auto"/>
           </w:tcPr>
           <w:p>
             <w:pPr>
@@ -1447,7 +1441,6 @@
         <w:tc>
           <w:tcPr>
             <w:tcW w:w="3071" w:type="dxa"/>
-            <w:shd w:val="clear" w:color="auto" w:fill="auto"/>
           </w:tcPr>
           <w:p>
             <w:pPr>
@@ -1461,7 +1454,6 @@
         <w:tc>
           <w:tcPr>
             <w:tcW w:w="5649" w:type="dxa"/>
-            <w:shd w:val="clear" w:color="auto" w:fill="auto"/>
           </w:tcPr>
           <w:p>
             <w:pPr>
@@ -1483,8 +1475,8 @@
           <w:szCs w:val="24"/>
         </w:rPr>
       </w:pPr>
-      <w:bookmarkStart w:id="5" w:name="_heading=h.t2xbwwx5fc69" w:colFirst="0" w:colLast="0"/>
-      <w:bookmarkEnd w:id="5"/>
+      <w:bookmarkStart w:id="4" w:name="_heading=h.t2xbwwx5fc69" w:colFirst="0" w:colLast="0"/>
+      <w:bookmarkEnd w:id="4"/>
     </w:p>
     <w:p>
       <w:pPr>
@@ -1533,7 +1525,6 @@
         <w:tc>
           <w:tcPr>
             <w:tcW w:w="2084" w:type="dxa"/>
-            <w:shd w:val="clear" w:color="auto" w:fill="auto"/>
           </w:tcPr>
           <w:p>
             <w:pPr>
@@ -1554,7 +1545,6 @@
         <w:tc>
           <w:tcPr>
             <w:tcW w:w="3452" w:type="dxa"/>
-            <w:shd w:val="clear" w:color="auto" w:fill="auto"/>
           </w:tcPr>
           <w:p>
             <w:pPr>
@@ -1575,7 +1565,6 @@
         <w:tc>
           <w:tcPr>
             <w:tcW w:w="3184" w:type="dxa"/>
-            <w:shd w:val="clear" w:color="auto" w:fill="auto"/>
           </w:tcPr>
           <w:p>
             <w:pPr>
@@ -1598,7 +1587,6 @@
         <w:tc>
           <w:tcPr>
             <w:tcW w:w="2084" w:type="dxa"/>
-            <w:shd w:val="clear" w:color="auto" w:fill="auto"/>
           </w:tcPr>
           <w:p>
             <w:pPr>
@@ -1621,7 +1609,6 @@
         <w:tc>
           <w:tcPr>
             <w:tcW w:w="3452" w:type="dxa"/>
-            <w:shd w:val="clear" w:color="auto" w:fill="auto"/>
           </w:tcPr>
           <w:p>
             <w:pPr>
@@ -1644,7 +1631,6 @@
         <w:tc>
           <w:tcPr>
             <w:tcW w:w="3184" w:type="dxa"/>
-            <w:shd w:val="clear" w:color="auto" w:fill="auto"/>
           </w:tcPr>
           <w:p>
             <w:pPr>
@@ -1669,7 +1655,6 @@
         <w:tc>
           <w:tcPr>
             <w:tcW w:w="2084" w:type="dxa"/>
-            <w:shd w:val="clear" w:color="auto" w:fill="auto"/>
           </w:tcPr>
           <w:p>
             <w:pPr>
@@ -1692,7 +1677,6 @@
         <w:tc>
           <w:tcPr>
             <w:tcW w:w="3452" w:type="dxa"/>
-            <w:shd w:val="clear" w:color="auto" w:fill="auto"/>
           </w:tcPr>
           <w:p>
             <w:pPr>
@@ -1708,23 +1692,37 @@
                 <w:b/>
                 <w:bCs/>
               </w:rPr>
-              <w:t xml:space="preserve">Diego </w:t>
-            </w:r>
-            <w:proofErr w:type="spellStart"/>
-            <w:r>
+              <w:t>Diego Mattas</w:t>
+            </w:r>
+          </w:p>
+        </w:tc>
+        <w:tc>
+          <w:tcPr>
+            <w:tcW w:w="3184" w:type="dxa"/>
+          </w:tcPr>
+          <w:p>
+            <w:pPr>
+              <w:spacing w:after="0" w:line="240" w:lineRule="auto"/>
+              <w:jc w:val="center"/>
               <w:rPr>
                 <w:b/>
                 <w:bCs/>
               </w:rPr>
-              <w:t>Mattas</w:t>
-            </w:r>
-            <w:proofErr w:type="spellEnd"/>
-          </w:p>
-        </w:tc>
-        <w:tc>
-          <w:tcPr>
-            <w:tcW w:w="3184" w:type="dxa"/>
-            <w:shd w:val="clear" w:color="auto" w:fill="auto"/>
+            </w:pPr>
+            <w:r>
+              <w:rPr>
+                <w:b/>
+                <w:bCs/>
+              </w:rPr>
+              <w:t>di.mattas@duocuc.cl</w:t>
+            </w:r>
+          </w:p>
+        </w:tc>
+      </w:tr>
+      <w:tr>
+        <w:tc>
+          <w:tcPr>
+            <w:tcW w:w="2084" w:type="dxa"/>
           </w:tcPr>
           <w:p>
             <w:pPr>
@@ -1740,16 +1738,13 @@
                 <w:b/>
                 <w:bCs/>
               </w:rPr>
-              <w:t>di.mattas@duocuc.cl</w:t>
-            </w:r>
-          </w:p>
-        </w:tc>
-      </w:tr>
-      <w:tr>
-        <w:tc>
-          <w:tcPr>
-            <w:tcW w:w="2084" w:type="dxa"/>
-            <w:shd w:val="clear" w:color="auto" w:fill="auto"/>
+              <w:t>21.029.574-7</w:t>
+            </w:r>
+          </w:p>
+        </w:tc>
+        <w:tc>
+          <w:tcPr>
+            <w:tcW w:w="3452" w:type="dxa"/>
           </w:tcPr>
           <w:p>
             <w:pPr>
@@ -1765,29 +1760,6 @@
                 <w:b/>
                 <w:bCs/>
               </w:rPr>
-              <w:t>21.029.574-7</w:t>
-            </w:r>
-          </w:p>
-        </w:tc>
-        <w:tc>
-          <w:tcPr>
-            <w:tcW w:w="3452" w:type="dxa"/>
-            <w:shd w:val="clear" w:color="auto" w:fill="auto"/>
-          </w:tcPr>
-          <w:p>
-            <w:pPr>
-              <w:spacing w:after="0" w:line="240" w:lineRule="auto"/>
-              <w:jc w:val="center"/>
-              <w:rPr>
-                <w:b/>
-                <w:bCs/>
-              </w:rPr>
-            </w:pPr>
-            <w:r>
-              <w:rPr>
-                <w:b/>
-                <w:bCs/>
-              </w:rPr>
               <w:t>Nicolás Lizama</w:t>
             </w:r>
           </w:p>
@@ -1795,7 +1767,6 @@
         <w:tc>
           <w:tcPr>
             <w:tcW w:w="3184" w:type="dxa"/>
-            <w:shd w:val="clear" w:color="auto" w:fill="auto"/>
           </w:tcPr>
           <w:p>
             <w:pPr>
@@ -1839,43 +1810,11 @@
       <w:pPr>
         <w:pStyle w:val="Ttulo1"/>
       </w:pPr>
-      <w:bookmarkStart w:id="6" w:name="_heading=h.wuw8vg2osv6" w:colFirst="0" w:colLast="0"/>
-      <w:bookmarkEnd w:id="6"/>
+      <w:bookmarkStart w:id="5" w:name="_heading=h.wuw8vg2osv6" w:colFirst="0" w:colLast="0"/>
+      <w:bookmarkEnd w:id="5"/>
       <w:r>
         <w:lastRenderedPageBreak/>
-        <w:t xml:space="preserve">Planilla </w:t>
-      </w:r>
-      <w:proofErr w:type="spellStart"/>
-      <w:r>
-        <w:t>product</w:t>
-      </w:r>
-      <w:proofErr w:type="spellEnd"/>
-      <w:r>
-        <w:t xml:space="preserve"> </w:t>
-      </w:r>
-      <w:proofErr w:type="spellStart"/>
-      <w:r>
-        <w:t>backlog</w:t>
-      </w:r>
-      <w:proofErr w:type="spellEnd"/>
-      <w:r>
-        <w:t xml:space="preserve"> con registro de avances día a día y validación del </w:t>
-      </w:r>
-      <w:proofErr w:type="spellStart"/>
-      <w:r>
-        <w:t>product</w:t>
-      </w:r>
-      <w:proofErr w:type="spellEnd"/>
-      <w:r>
-        <w:t xml:space="preserve"> </w:t>
-      </w:r>
-      <w:proofErr w:type="spellStart"/>
-      <w:r>
-        <w:t>owner</w:t>
-      </w:r>
-      <w:proofErr w:type="spellEnd"/>
-      <w:r>
-        <w:t>.</w:t>
+        <w:t>Planilla product backlog con registro de avances día a día y validación del product owner.</w:t>
       </w:r>
     </w:p>
     <w:p/>
@@ -2706,18 +2645,8 @@
                 <w:sz w:val="20"/>
                 <w:szCs w:val="20"/>
               </w:rPr>
-              <w:t xml:space="preserve">Diego </w:t>
-            </w:r>
-            <w:proofErr w:type="spellStart"/>
-            <w:r>
-              <w:rPr>
-                <w:rFonts w:ascii="Arial" w:hAnsi="Arial" w:cs="Arial"/>
-                <w:sz w:val="20"/>
-                <w:szCs w:val="20"/>
-              </w:rPr>
-              <w:t>Mattas</w:t>
-            </w:r>
-            <w:proofErr w:type="spellEnd"/>
+              <w:t>Diego Mattas</w:t>
+            </w:r>
           </w:p>
         </w:tc>
         <w:tc>
@@ -3298,18 +3227,8 @@
                 <w:sz w:val="20"/>
                 <w:szCs w:val="20"/>
               </w:rPr>
-              <w:t xml:space="preserve">Diego </w:t>
-            </w:r>
-            <w:proofErr w:type="spellStart"/>
-            <w:r>
-              <w:rPr>
-                <w:rFonts w:ascii="Arial" w:hAnsi="Arial" w:cs="Arial"/>
-                <w:sz w:val="20"/>
-                <w:szCs w:val="20"/>
-              </w:rPr>
-              <w:t>Mattas</w:t>
-            </w:r>
-            <w:proofErr w:type="spellEnd"/>
+              <w:t>Diego Mattas</w:t>
+            </w:r>
           </w:p>
         </w:tc>
         <w:tc>
@@ -4472,18 +4391,8 @@
                 <w:sz w:val="20"/>
                 <w:szCs w:val="20"/>
               </w:rPr>
-              <w:t xml:space="preserve">Diego </w:t>
-            </w:r>
-            <w:proofErr w:type="spellStart"/>
-            <w:r>
-              <w:rPr>
-                <w:rFonts w:ascii="Arial" w:hAnsi="Arial" w:cs="Arial"/>
-                <w:sz w:val="20"/>
-                <w:szCs w:val="20"/>
-              </w:rPr>
-              <w:t>Mattas</w:t>
-            </w:r>
-            <w:proofErr w:type="spellEnd"/>
+              <w:t>Diego Mattas</w:t>
+            </w:r>
           </w:p>
         </w:tc>
         <w:tc>
@@ -4674,23 +4583,13 @@
                 <w:szCs w:val="20"/>
               </w:rPr>
             </w:pPr>
-            <w:proofErr w:type="spellStart"/>
-            <w:r>
-              <w:rPr>
-                <w:rFonts w:ascii="Arial" w:hAnsi="Arial" w:cs="Arial"/>
-                <w:sz w:val="20"/>
-                <w:szCs w:val="20"/>
-              </w:rPr>
-              <w:t>Eval</w:t>
-            </w:r>
-            <w:proofErr w:type="spellEnd"/>
-            <w:r>
-              <w:rPr>
-                <w:rFonts w:ascii="Arial" w:hAnsi="Arial" w:cs="Arial"/>
-                <w:sz w:val="20"/>
-                <w:szCs w:val="20"/>
-              </w:rPr>
-              <w:t>. Inicial</w:t>
+            <w:r>
+              <w:rPr>
+                <w:rFonts w:ascii="Arial" w:hAnsi="Arial" w:cs="Arial"/>
+                <w:sz w:val="20"/>
+                <w:szCs w:val="20"/>
+              </w:rPr>
+              <w:t>Eval. Inicial</w:t>
             </w:r>
           </w:p>
         </w:tc>
@@ -4978,23 +4877,13 @@
                 <w:szCs w:val="20"/>
               </w:rPr>
             </w:pPr>
-            <w:proofErr w:type="spellStart"/>
-            <w:r>
-              <w:rPr>
-                <w:rFonts w:ascii="Arial" w:hAnsi="Arial" w:cs="Arial"/>
-                <w:sz w:val="20"/>
-                <w:szCs w:val="20"/>
-              </w:rPr>
-              <w:t>Eval</w:t>
-            </w:r>
-            <w:proofErr w:type="spellEnd"/>
-            <w:r>
-              <w:rPr>
-                <w:rFonts w:ascii="Arial" w:hAnsi="Arial" w:cs="Arial"/>
-                <w:sz w:val="20"/>
-                <w:szCs w:val="20"/>
-              </w:rPr>
-              <w:t>. Inicial</w:t>
+            <w:r>
+              <w:rPr>
+                <w:rFonts w:ascii="Arial" w:hAnsi="Arial" w:cs="Arial"/>
+                <w:sz w:val="20"/>
+                <w:szCs w:val="20"/>
+              </w:rPr>
+              <w:t>Eval. Inicial</w:t>
             </w:r>
           </w:p>
         </w:tc>
@@ -5090,18 +4979,8 @@
                 <w:sz w:val="20"/>
                 <w:szCs w:val="20"/>
               </w:rPr>
-              <w:t xml:space="preserve">Diego </w:t>
-            </w:r>
-            <w:proofErr w:type="spellStart"/>
-            <w:r>
-              <w:rPr>
-                <w:rFonts w:ascii="Arial" w:hAnsi="Arial" w:cs="Arial"/>
-                <w:sz w:val="20"/>
-                <w:szCs w:val="20"/>
-              </w:rPr>
-              <w:t>Mattas</w:t>
-            </w:r>
-            <w:proofErr w:type="spellEnd"/>
+              <w:t>Diego Mattas</w:t>
+            </w:r>
           </w:p>
         </w:tc>
         <w:tc>
@@ -5272,8 +5151,8 @@
       <w:pPr>
         <w:pStyle w:val="Ttulo1"/>
       </w:pPr>
-      <w:bookmarkStart w:id="7" w:name="_heading=h.scesi4ss8bcm" w:colFirst="0" w:colLast="0"/>
-      <w:bookmarkEnd w:id="7"/>
+      <w:bookmarkStart w:id="6" w:name="_heading=h.scesi4ss8bcm" w:colFirst="0" w:colLast="0"/>
+      <w:bookmarkEnd w:id="6"/>
       <w:r>
         <w:t>Gráfico de avance del sprint 2</w:t>
       </w:r>
@@ -5313,7 +5192,7 @@
                 <w:lang w:val="en-US"/>
               </w:rPr>
               <w:lastRenderedPageBreak/>
-              <w:pict>
+              <w:pict w14:anchorId="0CDDD90E">
                 <v:shapetype id="_x0000_t75" coordsize="21600,21600" o:spt="75" o:preferrelative="t" path="m@4@5l@4@11@9@11@9@5xe" filled="f" stroked="f">
                   <v:stroke joinstyle="miter"/>
                   <v:formulas>
@@ -5333,7 +5212,7 @@
                   <v:path o:extrusionok="f" gradientshapeok="t" o:connecttype="rect"/>
                   <o:lock v:ext="edit" aspectratio="t"/>
                 </v:shapetype>
-                <v:shape id="_x0000_i1025" type="#_x0000_t75" style="width:250.5pt;height:387.75pt">
+                <v:shape id="_x0000_i1025" type="#_x0000_t75" style="width:250.8pt;height:387.6pt">
                   <v:imagedata r:id="rId7" o:title="Captura de pantalla 2026-06-15 175428"/>
                 </v:shape>
               </w:pict>
@@ -5360,8 +5239,8 @@
       <w:pPr>
         <w:pStyle w:val="Ttulo1"/>
       </w:pPr>
-      <w:bookmarkStart w:id="8" w:name="_heading=h.rd53737e8xrv" w:colFirst="0" w:colLast="0"/>
-      <w:bookmarkEnd w:id="8"/>
+      <w:bookmarkStart w:id="7" w:name="_heading=h.rd53737e8xrv" w:colFirst="0" w:colLast="0"/>
+      <w:bookmarkEnd w:id="7"/>
       <w:r>
         <w:t>Pila del producto actualizada.</w:t>
       </w:r>
@@ -5540,25 +5419,7 @@
                 <w:sz w:val="20"/>
                 <w:szCs w:val="20"/>
               </w:rPr>
-              <w:t>(</w:t>
-            </w:r>
-            <w:proofErr w:type="spellStart"/>
-            <w:r>
-              <w:rPr>
-                <w:rFonts w:ascii="Arial" w:hAnsi="Arial" w:cs="Arial"/>
-                <w:sz w:val="20"/>
-                <w:szCs w:val="20"/>
-              </w:rPr>
-              <w:t>Sprints</w:t>
-            </w:r>
-            <w:proofErr w:type="spellEnd"/>
-            <w:r>
-              <w:rPr>
-                <w:rFonts w:ascii="Arial" w:hAnsi="Arial" w:cs="Arial"/>
-                <w:sz w:val="20"/>
-                <w:szCs w:val="20"/>
-              </w:rPr>
-              <w:t xml:space="preserve"> 1 y 2)</w:t>
+              <w:t>(Sprints 1 y 2)</w:t>
             </w:r>
           </w:p>
         </w:tc>
@@ -6980,25 +6841,7 @@
                 <w:sz w:val="20"/>
                 <w:szCs w:val="20"/>
               </w:rPr>
-              <w:t>(</w:t>
-            </w:r>
-            <w:proofErr w:type="spellStart"/>
-            <w:r>
-              <w:rPr>
-                <w:rFonts w:ascii="Arial" w:hAnsi="Arial" w:cs="Arial"/>
-                <w:sz w:val="20"/>
-                <w:szCs w:val="20"/>
-              </w:rPr>
-              <w:t>Sprints</w:t>
-            </w:r>
-            <w:proofErr w:type="spellEnd"/>
-            <w:r>
-              <w:rPr>
-                <w:rFonts w:ascii="Arial" w:hAnsi="Arial" w:cs="Arial"/>
-                <w:sz w:val="20"/>
-                <w:szCs w:val="20"/>
-              </w:rPr>
-              <w:t xml:space="preserve"> 1 y 2)</w:t>
+              <w:t>(Sprints 1 y 2)</w:t>
             </w:r>
           </w:p>
         </w:tc>
@@ -7087,7 +6930,7 @@
 </file>
 
 <file path=word/endnotes.xml><?xml version="1.0" encoding="utf-8"?>
-<w:endnotes xmlns:wpc="http://schemas.microsoft.com/office/word/2010/wordprocessingCanvas" xmlns:cx="http://schemas.microsoft.com/office/drawing/2014/chartex" xmlns:mc="http://schemas.openxmlformats.org/markup-compatibility/2006" xmlns:o="urn:schemas-microsoft-com:office:office" xmlns:r="http://schemas.openxmlformats.org/officeDocument/2006/relationships" xmlns:m="http://schemas.openxmlformats.org/officeDocument/2006/math" xmlns:v="urn:schemas-microsoft-com:vml" xmlns:wp14="http://schemas.microsoft.com/office/word/2010/wordprocessingDrawing" xmlns:wp="http://schemas.openxmlformats.org/drawingml/2006/wordprocessingDrawing" xmlns:w10="urn:schemas-microsoft-com:office:word" xmlns:w="http://schemas.openxmlformats.org/wordprocessingml/2006/main" xmlns:w14="http://schemas.microsoft.com/office/word/2010/wordml" xmlns:w15="http://schemas.microsoft.com/office/word/2012/wordml" xmlns:w16se="http://schemas.microsoft.com/office/word/2015/wordml/symex" xmlns:wpg="http://schemas.microsoft.com/office/word/2010/wordprocessingGroup" xmlns:wpi="http://schemas.microsoft.com/office/word/2010/wordprocessingInk" xmlns:wne="http://schemas.microsoft.com/office/word/2006/wordml" xmlns:wps="http://schemas.microsoft.com/office/word/2010/wordprocessingShape" mc:Ignorable="w14 w15 w16se wp14">
+<w:endnotes xmlns:wpc="http://schemas.microsoft.com/office/word/2010/wordprocessingCanvas" xmlns:cx="http://schemas.microsoft.com/office/drawing/2014/chartex" xmlns:cx1="http://schemas.microsoft.com/office/drawing/2015/9/8/chartex" xmlns:cx2="http://schemas.microsoft.com/office/drawing/2015/10/21/chartex" xmlns:cx3="http://schemas.microsoft.com/office/drawing/2016/5/9/chartex" xmlns:cx4="http://schemas.microsoft.com/office/drawing/2016/5/10/chartex" xmlns:cx5="http://schemas.microsoft.com/office/drawing/2016/5/11/chartex" xmlns:cx6="http://schemas.microsoft.com/office/drawing/2016/5/12/chartex" xmlns:cx7="http://schemas.microsoft.com/office/drawing/2016/5/13/chartex" xmlns:cx8="http://schemas.microsoft.com/office/drawing/2016/5/14/chartex" xmlns:mc="http://schemas.openxmlformats.org/markup-compatibility/2006" xmlns:aink="http://schemas.microsoft.com/office/drawing/2016/ink" xmlns:am3d="http://schemas.microsoft.com/office/drawing/2017/model3d" xmlns:o="urn:schemas-microsoft-com:office:office" xmlns:oel="http://schemas.microsoft.com/office/2019/extlst" xmlns:r="http://schemas.openxmlformats.org/officeDocument/2006/relationships" xmlns:m="http://schemas.openxmlformats.org/officeDocument/2006/math" xmlns:v="urn:schemas-microsoft-com:vml" xmlns:wp14="http://schemas.microsoft.com/office/word/2010/wordprocessingDrawing" xmlns:wp="http://schemas.openxmlformats.org/drawingml/2006/wordprocessingDrawing" xmlns:w10="urn:schemas-microsoft-com:office:word" xmlns:w="http://schemas.openxmlformats.org/wordprocessingml/2006/main" xmlns:w14="http://schemas.microsoft.com/office/word/2010/wordml" xmlns:w15="http://schemas.microsoft.com/office/word/2012/wordml" xmlns:w16cex="http://schemas.microsoft.com/office/word/2018/wordml/cex" xmlns:w16cid="http://schemas.microsoft.com/office/word/2016/wordml/cid" xmlns:w16="http://schemas.microsoft.com/office/word/2018/wordml" xmlns:w16du="http://schemas.microsoft.com/office/word/2023/wordml/word16du" xmlns:w16sdtdh="http://schemas.microsoft.com/office/word/2020/wordml/sdtdatahash" xmlns:w16sdtfl="http://schemas.microsoft.com/office/word/2024/wordml/sdtformatlock" xmlns:w16se="http://schemas.microsoft.com/office/word/2015/wordml/symex" xmlns:wpg="http://schemas.microsoft.com/office/word/2010/wordprocessingGroup" xmlns:wpi="http://schemas.microsoft.com/office/word/2010/wordprocessingInk" xmlns:wne="http://schemas.microsoft.com/office/word/2006/wordml" xmlns:wps="http://schemas.microsoft.com/office/word/2010/wordprocessingShape" mc:Ignorable="w14 w15 w16se w16cid w16 w16cex w16sdtdh w16sdtfl w16du wp14">
   <w:endnote w:type="separator" w:id="-1">
     <w:p>
       <w:pPr>
@@ -7112,7 +6955,7 @@
 </file>
 
 <file path=word/footer1.xml><?xml version="1.0" encoding="utf-8"?>
-<w:ftr xmlns:wpc="http://schemas.microsoft.com/office/word/2010/wordprocessingCanvas" xmlns:cx="http://schemas.microsoft.com/office/drawing/2014/chartex" xmlns:mc="http://schemas.openxmlformats.org/markup-compatibility/2006" xmlns:o="urn:schemas-microsoft-com:office:office" xmlns:r="http://schemas.openxmlformats.org/officeDocument/2006/relationships" xmlns:m="http://schemas.openxmlformats.org/officeDocument/2006/math" xmlns:v="urn:schemas-microsoft-com:vml" xmlns:wp14="http://schemas.microsoft.com/office/word/2010/wordprocessingDrawing" xmlns:wp="http://schemas.openxmlformats.org/drawingml/2006/wordprocessingDrawing" xmlns:w10="urn:schemas-microsoft-com:office:word" xmlns:w="http://schemas.openxmlformats.org/wordprocessingml/2006/main" xmlns:w14="http://schemas.microsoft.com/office/word/2010/wordml" xmlns:w15="http://schemas.microsoft.com/office/word/2012/wordml" xmlns:w16se="http://schemas.microsoft.com/office/word/2015/wordml/symex" xmlns:wpg="http://schemas.microsoft.com/office/word/2010/wordprocessingGroup" xmlns:wpi="http://schemas.microsoft.com/office/word/2010/wordprocessingInk" xmlns:wne="http://schemas.microsoft.com/office/word/2006/wordml" xmlns:wps="http://schemas.microsoft.com/office/word/2010/wordprocessingShape" mc:Ignorable="w14 w15 w16se wp14">
+<w:ftr xmlns:wpc="http://schemas.microsoft.com/office/word/2010/wordprocessingCanvas" xmlns:cx="http://schemas.microsoft.com/office/drawing/2014/chartex" xmlns:cx1="http://schemas.microsoft.com/office/drawing/2015/9/8/chartex" xmlns:cx2="http://schemas.microsoft.com/office/drawing/2015/10/21/chartex" xmlns:cx3="http://schemas.microsoft.com/office/drawing/2016/5/9/chartex" xmlns:cx4="http://schemas.microsoft.com/office/drawing/2016/5/10/chartex" xmlns:cx5="http://schemas.microsoft.com/office/drawing/2016/5/11/chartex" xmlns:cx6="http://schemas.microsoft.com/office/drawing/2016/5/12/chartex" xmlns:cx7="http://schemas.microsoft.com/office/drawing/2016/5/13/chartex" xmlns:cx8="http://schemas.microsoft.com/office/drawing/2016/5/14/chartex" xmlns:mc="http://schemas.openxmlformats.org/markup-compatibility/2006" xmlns:aink="http://schemas.microsoft.com/office/drawing/2016/ink" xmlns:am3d="http://schemas.microsoft.com/office/drawing/2017/model3d" xmlns:o="urn:schemas-microsoft-com:office:office" xmlns:oel="http://schemas.microsoft.com/office/2019/extlst" xmlns:r="http://schemas.openxmlformats.org/officeDocument/2006/relationships" xmlns:m="http://schemas.openxmlformats.org/officeDocument/2006/math" xmlns:v="urn:schemas-microsoft-com:vml" xmlns:wp14="http://schemas.microsoft.com/office/word/2010/wordprocessingDrawing" xmlns:wp="http://schemas.openxmlformats.org/drawingml/2006/wordprocessingDrawing" xmlns:w10="urn:schemas-microsoft-com:office:word" xmlns:w="http://schemas.openxmlformats.org/wordprocessingml/2006/main" xmlns:w14="http://schemas.microsoft.com/office/word/2010/wordml" xmlns:w15="http://schemas.microsoft.com/office/word/2012/wordml" xmlns:w16cex="http://schemas.microsoft.com/office/word/2018/wordml/cex" xmlns:w16cid="http://schemas.microsoft.com/office/word/2016/wordml/cid" xmlns:w16="http://schemas.microsoft.com/office/word/2018/wordml" xmlns:w16du="http://schemas.microsoft.com/office/word/2023/wordml/word16du" xmlns:w16sdtdh="http://schemas.microsoft.com/office/word/2020/wordml/sdtdatahash" xmlns:w16sdtfl="http://schemas.microsoft.com/office/word/2024/wordml/sdtformatlock" xmlns:w16se="http://schemas.microsoft.com/office/word/2015/wordml/symex" xmlns:wpg="http://schemas.microsoft.com/office/word/2010/wordprocessingGroup" xmlns:wpi="http://schemas.microsoft.com/office/word/2010/wordprocessingInk" xmlns:wne="http://schemas.microsoft.com/office/word/2006/wordml" xmlns:wps="http://schemas.microsoft.com/office/word/2010/wordprocessingShape" mc:Ignorable="w14 w15 w16se w16cid w16 w16cex w16sdtdh w16sdtfl w16du wp14">
   <w:p>
     <w:pPr>
       <w:pBdr>
@@ -7146,18 +6989,8 @@
         <w:sz w:val="20"/>
         <w:szCs w:val="20"/>
       </w:rPr>
-      <w:t xml:space="preserve">, Ingeniería de Software – </w:t>
+      <w:t>, Ingeniería de Software – DuocUC</w:t>
     </w:r>
-    <w:proofErr w:type="spellStart"/>
-    <w:r>
-      <w:rPr>
-        <w:color w:val="000000"/>
-        <w:sz w:val="20"/>
-        <w:szCs w:val="20"/>
-      </w:rPr>
-      <w:t>DuocUC</w:t>
-    </w:r>
-    <w:proofErr w:type="spellEnd"/>
   </w:p>
   <w:p>
     <w:pPr>
@@ -7182,7 +7015,7 @@
 </file>
 
 <file path=word/footnotes.xml><?xml version="1.0" encoding="utf-8"?>
-<w:footnotes xmlns:wpc="http://schemas.microsoft.com/office/word/2010/wordprocessingCanvas" xmlns:cx="http://schemas.microsoft.com/office/drawing/2014/chartex" xmlns:mc="http://schemas.openxmlformats.org/markup-compatibility/2006" xmlns:o="urn:schemas-microsoft-com:office:office" xmlns:r="http://schemas.openxmlformats.org/officeDocument/2006/relationships" xmlns:m="http://schemas.openxmlformats.org/officeDocument/2006/math" xmlns:v="urn:schemas-microsoft-com:vml" xmlns:wp14="http://schemas.microsoft.com/office/word/2010/wordprocessingDrawing" xmlns:wp="http://schemas.openxmlformats.org/drawingml/2006/wordprocessingDrawing" xmlns:w10="urn:schemas-microsoft-com:office:word" xmlns:w="http://schemas.openxmlformats.org/wordprocessingml/2006/main" xmlns:w14="http://schemas.microsoft.com/office/word/2010/wordml" xmlns:w15="http://schemas.microsoft.com/office/word/2012/wordml" xmlns:w16se="http://schemas.microsoft.com/office/word/2015/wordml/symex" xmlns:wpg="http://schemas.microsoft.com/office/word/2010/wordprocessingGroup" xmlns:wpi="http://schemas.microsoft.com/office/word/2010/wordprocessingInk" xmlns:wne="http://schemas.microsoft.com/office/word/2006/wordml" xmlns:wps="http://schemas.microsoft.com/office/word/2010/wordprocessingShape" mc:Ignorable="w14 w15 w16se wp14">
+<w:footnotes xmlns:wpc="http://schemas.microsoft.com/office/word/2010/wordprocessingCanvas" xmlns:cx="http://schemas.microsoft.com/office/drawing/2014/chartex" xmlns:cx1="http://schemas.microsoft.com/office/drawing/2015/9/8/chartex" xmlns:cx2="http://schemas.microsoft.com/office/drawing/2015/10/21/chartex" xmlns:cx3="http://schemas.microsoft.com/office/drawing/2016/5/9/chartex" xmlns:cx4="http://schemas.microsoft.com/office/drawing/2016/5/10/chartex" xmlns:cx5="http://schemas.microsoft.com/office/drawing/2016/5/11/chartex" xmlns:cx6="http://schemas.microsoft.com/office/drawing/2016/5/12/chartex" xmlns:cx7="http://schemas.microsoft.com/office/drawing/2016/5/13/chartex" xmlns:cx8="http://schemas.microsoft.com/office/drawing/2016/5/14/chartex" xmlns:mc="http://schemas.openxmlformats.org/markup-compatibility/2006" xmlns:aink="http://schemas.microsoft.com/office/drawing/2016/ink" xmlns:am3d="http://schemas.microsoft.com/office/drawing/2017/model3d" xmlns:o="urn:schemas-microsoft-com:office:office" xmlns:oel="http://schemas.microsoft.com/office/2019/extlst" xmlns:r="http://schemas.openxmlformats.org/officeDocument/2006/relationships" xmlns:m="http://schemas.openxmlformats.org/officeDocument/2006/math" xmlns:v="urn:schemas-microsoft-com:vml" xmlns:wp14="http://schemas.microsoft.com/office/word/2010/wordprocessingDrawing" xmlns:wp="http://schemas.openxmlformats.org/drawingml/2006/wordprocessingDrawing" xmlns:w10="urn:schemas-microsoft-com:office:word" xmlns:w="http://schemas.openxmlformats.org/wordprocessingml/2006/main" xmlns:w14="http://schemas.microsoft.com/office/word/2010/wordml" xmlns:w15="http://schemas.microsoft.com/office/word/2012/wordml" xmlns:w16cex="http://schemas.microsoft.com/office/word/2018/wordml/cex" xmlns:w16cid="http://schemas.microsoft.com/office/word/2016/wordml/cid" xmlns:w16="http://schemas.microsoft.com/office/word/2018/wordml" xmlns:w16du="http://schemas.microsoft.com/office/word/2023/wordml/word16du" xmlns:w16sdtdh="http://schemas.microsoft.com/office/word/2020/wordml/sdtdatahash" xmlns:w16sdtfl="http://schemas.microsoft.com/office/word/2024/wordml/sdtformatlock" xmlns:w16se="http://schemas.microsoft.com/office/word/2015/wordml/symex" xmlns:wpg="http://schemas.microsoft.com/office/word/2010/wordprocessingGroup" xmlns:wpi="http://schemas.microsoft.com/office/word/2010/wordprocessingInk" xmlns:wne="http://schemas.microsoft.com/office/word/2006/wordml" xmlns:wps="http://schemas.microsoft.com/office/word/2010/wordprocessingShape" mc:Ignorable="w14 w15 w16se w16cid w16 w16cex w16sdtdh w16sdtfl w16du wp14">
   <w:footnote w:type="separator" w:id="-1">
     <w:p>
       <w:pPr>
@@ -7207,7 +7040,7 @@
 </file>
 
 <file path=word/header1.xml><?xml version="1.0" encoding="utf-8"?>
-<w:hdr xmlns:wpc="http://schemas.microsoft.com/office/word/2010/wordprocessingCanvas" xmlns:cx="http://schemas.microsoft.com/office/drawing/2014/chartex" xmlns:mc="http://schemas.openxmlformats.org/markup-compatibility/2006" xmlns:o="urn:schemas-microsoft-com:office:office" xmlns:r="http://schemas.openxmlformats.org/officeDocument/2006/relationships" xmlns:m="http://schemas.openxmlformats.org/officeDocument/2006/math" xmlns:v="urn:schemas-microsoft-com:vml" xmlns:wp14="http://schemas.microsoft.com/office/word/2010/wordprocessingDrawing" xmlns:wp="http://schemas.openxmlformats.org/drawingml/2006/wordprocessingDrawing" xmlns:w10="urn:schemas-microsoft-com:office:word" xmlns:w="http://schemas.openxmlformats.org/wordprocessingml/2006/main" xmlns:w14="http://schemas.microsoft.com/office/word/2010/wordml" xmlns:w15="http://schemas.microsoft.com/office/word/2012/wordml" xmlns:w16se="http://schemas.microsoft.com/office/word/2015/wordml/symex" xmlns:wpg="http://schemas.microsoft.com/office/word/2010/wordprocessingGroup" xmlns:wpi="http://schemas.microsoft.com/office/word/2010/wordprocessingInk" xmlns:wne="http://schemas.microsoft.com/office/word/2006/wordml" xmlns:wps="http://schemas.microsoft.com/office/word/2010/wordprocessingShape" mc:Ignorable="w14 w15 w16se wp14">
+<w:hdr xmlns:wpc="http://schemas.microsoft.com/office/word/2010/wordprocessingCanvas" xmlns:cx="http://schemas.microsoft.com/office/drawing/2014/chartex" xmlns:cx1="http://schemas.microsoft.com/office/drawing/2015/9/8/chartex" xmlns:cx2="http://schemas.microsoft.com/office/drawing/2015/10/21/chartex" xmlns:cx3="http://schemas.microsoft.com/office/drawing/2016/5/9/chartex" xmlns:cx4="http://schemas.microsoft.com/office/drawing/2016/5/10/chartex" xmlns:cx5="http://schemas.microsoft.com/office/drawing/2016/5/11/chartex" xmlns:cx6="http://schemas.microsoft.com/office/drawing/2016/5/12/chartex" xmlns:cx7="http://schemas.microsoft.com/office/drawing/2016/5/13/chartex" xmlns:cx8="http://schemas.microsoft.com/office/drawing/2016/5/14/chartex" xmlns:mc="http://schemas.openxmlformats.org/markup-compatibility/2006" xmlns:aink="http://schemas.microsoft.com/office/drawing/2016/ink" xmlns:am3d="http://schemas.microsoft.com/office/drawing/2017/model3d" xmlns:o="urn:schemas-microsoft-com:office:office" xmlns:oel="http://schemas.microsoft.com/office/2019/extlst" xmlns:r="http://schemas.openxmlformats.org/officeDocument/2006/relationships" xmlns:m="http://schemas.openxmlformats.org/officeDocument/2006/math" xmlns:v="urn:schemas-microsoft-com:vml" xmlns:wp14="http://schemas.microsoft.com/office/word/2010/wordprocessingDrawing" xmlns:wp="http://schemas.openxmlformats.org/drawingml/2006/wordprocessingDrawing" xmlns:w10="urn:schemas-microsoft-com:office:word" xmlns:w="http://schemas.openxmlformats.org/wordprocessingml/2006/main" xmlns:w14="http://schemas.microsoft.com/office/word/2010/wordml" xmlns:w15="http://schemas.microsoft.com/office/word/2012/wordml" xmlns:w16cex="http://schemas.microsoft.com/office/word/2018/wordml/cex" xmlns:w16cid="http://schemas.microsoft.com/office/word/2016/wordml/cid" xmlns:w16="http://schemas.microsoft.com/office/word/2018/wordml" xmlns:w16du="http://schemas.microsoft.com/office/word/2023/wordml/word16du" xmlns:w16sdtdh="http://schemas.microsoft.com/office/word/2020/wordml/sdtdatahash" xmlns:w16sdtfl="http://schemas.microsoft.com/office/word/2024/wordml/sdtformatlock" xmlns:w16se="http://schemas.microsoft.com/office/word/2015/wordml/symex" xmlns:wpg="http://schemas.microsoft.com/office/word/2010/wordprocessingGroup" xmlns:wpi="http://schemas.microsoft.com/office/word/2010/wordprocessingInk" xmlns:wne="http://schemas.microsoft.com/office/word/2006/wordml" xmlns:wps="http://schemas.microsoft.com/office/word/2010/wordprocessingShape" mc:Ignorable="w14 w15 w16se w16cid w16 w16cex w16sdtdh w16sdtfl w16du wp14">
   <w:p>
     <w:pPr>
       <w:pBdr>
@@ -7281,7 +7114,7 @@
 </file>
 
 <file path=word/styles.xml><?xml version="1.0" encoding="utf-8"?>
-<w:styles xmlns:mc="http://schemas.openxmlformats.org/markup-compatibility/2006" xmlns:r="http://schemas.openxmlformats.org/officeDocument/2006/relationships" xmlns:w="http://schemas.openxmlformats.org/wordprocessingml/2006/main" xmlns:w14="http://schemas.microsoft.com/office/word/2010/wordml" xmlns:w15="http://schemas.microsoft.com/office/word/2012/wordml" xmlns:w16se="http://schemas.microsoft.com/office/word/2015/wordml/symex" mc:Ignorable="w14 w15 w16se">
+<w:styles xmlns:mc="http://schemas.openxmlformats.org/markup-compatibility/2006" xmlns:r="http://schemas.openxmlformats.org/officeDocument/2006/relationships" xmlns:w="http://schemas.openxmlformats.org/wordprocessingml/2006/main" xmlns:w14="http://schemas.microsoft.com/office/word/2010/wordml" xmlns:w15="http://schemas.microsoft.com/office/word/2012/wordml" xmlns:w16cex="http://schemas.microsoft.com/office/word/2018/wordml/cex" xmlns:w16cid="http://schemas.microsoft.com/office/word/2016/wordml/cid" xmlns:w16="http://schemas.microsoft.com/office/word/2018/wordml" xmlns:w16du="http://schemas.microsoft.com/office/word/2023/wordml/word16du" xmlns:w16sdtdh="http://schemas.microsoft.com/office/word/2020/wordml/sdtdatahash" xmlns:w16sdtfl="http://schemas.microsoft.com/office/word/2024/wordml/sdtformatlock" xmlns:w16se="http://schemas.microsoft.com/office/word/2015/wordml/symex" mc:Ignorable="w14 w15 w16se w16cid w16 w16cex w16sdtdh w16sdtfl w16du">
   <w:docDefaults>
     <w:rPrDefault>
       <w:rPr>
@@ -7297,7 +7130,7 @@
       </w:pPr>
     </w:pPrDefault>
   </w:docDefaults>
-  <w:latentStyles w:defLockedState="0" w:defUIPriority="99" w:defSemiHidden="0" w:defUnhideWhenUsed="0" w:defQFormat="0" w:count="371">
+  <w:latentStyles w:defLockedState="0" w:defUIPriority="99" w:defSemiHidden="0" w:defUnhideWhenUsed="0" w:defQFormat="0" w:count="376">
     <w:lsdException w:name="Normal" w:uiPriority="0" w:qFormat="1"/>
     <w:lsdException w:name="heading 1" w:uiPriority="9" w:qFormat="1"/>
     <w:lsdException w:name="heading 2" w:semiHidden="1" w:uiPriority="9" w:unhideWhenUsed="1" w:qFormat="1"/>
@@ -7669,6 +7502,11 @@
     <w:lsdException w:name="List Table 5 Dark Accent 6" w:uiPriority="50"/>
     <w:lsdException w:name="List Table 6 Colorful Accent 6" w:uiPriority="51"/>
     <w:lsdException w:name="List Table 7 Colorful Accent 6" w:uiPriority="52"/>
+    <w:lsdException w:name="Mention" w:semiHidden="1" w:unhideWhenUsed="1"/>
+    <w:lsdException w:name="Smart Hyperlink" w:semiHidden="1" w:unhideWhenUsed="1"/>
+    <w:lsdException w:name="Hashtag" w:semiHidden="1" w:unhideWhenUsed="1"/>
+    <w:lsdException w:name="Unresolved Mention" w:semiHidden="1" w:unhideWhenUsed="1"/>
+    <w:lsdException w:name="Smart Link" w:semiHidden="1" w:unhideWhenUsed="1"/>
   </w:latentStyles>
   <w:style w:type="paragraph" w:default="1" w:styleId="Normal">
     <w:name w:val="Normal"/>

</xml_diff>